<commit_message>
Corrige Documento 02 y 05 por rediseno a nivel de circuito: mediciones y umbrales ahora por circuito, no por tablero
</commit_message>
<xml_diff>
--- a/docs/Fase 2/Evidencias Proyecto (Version Agil)/Documento 02 - Product Backlog.docx
+++ b/docs/Fase 2/Evidencias Proyecto (Version Agil)/Documento 02 - Product Backlog.docx
@@ -31,7 +31,7 @@
             <w:tblLook w:val="04A0" w:firstRow="1" w:lastRow="0" w:firstColumn="1" w:lastColumn="0" w:noHBand="0" w:noVBand="1"/>
           </w:tblPr>
           <w:tblGrid>
-            <w:gridCol w:w="9054"/>
+            <w:gridCol w:w="8838"/>
           </w:tblGrid>
           <w:tr>
             <w:trPr>
@@ -332,7 +332,7 @@
             <w:tblLook w:val="04A0" w:firstRow="1" w:lastRow="0" w:firstColumn="1" w:lastColumn="0" w:noHBand="0" w:noVBand="1"/>
           </w:tblPr>
           <w:tblGrid>
-            <w:gridCol w:w="9054"/>
+            <w:gridCol w:w="8838"/>
           </w:tblGrid>
           <w:tr>
             <w:sdt>
@@ -2918,7 +2918,7 @@
         <w:rPr>
           <w:lang w:val="es-ES" w:eastAsia="es-ES"/>
         </w:rPr>
-        <w:t>Las mediciones quedan asociadas al tablero correspondiente.</w:t>
+        <w:t>Cada medición queda asociada al circuito correspondiente (y, a través de este, al tablero y dispositivo que la generaron).</w:t>
       </w:r>
     </w:p>
     <w:p>
@@ -2945,7 +2945,6 @@
         <w:pStyle w:val="Ttulo2"/>
       </w:pPr>
       <w:r>
-        <w:lastRenderedPageBreak/>
         <w:t>Historia 004</w:t>
       </w:r>
     </w:p>
@@ -3122,6 +3121,24 @@
           <w:lang w:val="es-ES" w:eastAsia="es-ES"/>
         </w:rPr>
         <w:t>La alarma queda registrada con fecha y hora.</w:t>
+      </w:r>
+    </w:p>
+    <w:p>
+      <w:pPr>
+        <w:pStyle w:val="Prrafodelista"/>
+        <w:numPr>
+          <w:ilvl w:val="0"/>
+          <w:numId w:val="14"/>
+        </w:numPr>
+        <w:rPr>
+          <w:lang w:val="es-ES" w:eastAsia="es-ES"/>
+        </w:rPr>
+      </w:pPr>
+      <w:r>
+        <w:rPr>
+          <w:lang w:val="es-ES" w:eastAsia="es-ES"/>
+        </w:rPr>
+        <w:t>El umbral se evalúa al nivel que corresponde a la variable: por circuito para corriente, voltaje y potencia, y por tablero para la temperatura general.</w:t>
       </w:r>
     </w:p>
     <w:p/>
@@ -7784,6 +7801,7 @@
   <w:rsids>
     <w:rsidRoot w:val="00960213"/>
     <w:rsid w:val="000609BA"/>
+    <w:rsid w:val="000A3F99"/>
     <w:rsid w:val="00194DF5"/>
     <w:rsid w:val="001B14B7"/>
     <w:rsid w:val="00230D02"/>
@@ -7798,18 +7816,17 @@
     <w:rsid w:val="00687CD9"/>
     <w:rsid w:val="006E2FCC"/>
     <w:rsid w:val="00704192"/>
+    <w:rsid w:val="007E1562"/>
     <w:rsid w:val="00825B36"/>
     <w:rsid w:val="008878A6"/>
     <w:rsid w:val="009007E1"/>
     <w:rsid w:val="00960213"/>
     <w:rsid w:val="009B18C0"/>
-    <w:rsid w:val="009C317A"/>
     <w:rsid w:val="00BD2436"/>
     <w:rsid w:val="00C47BA2"/>
     <w:rsid w:val="00C5036F"/>
     <w:rsid w:val="00C861E5"/>
     <w:rsid w:val="00CF44FB"/>
-    <w:rsid w:val="00D946FA"/>
     <w:rsid w:val="00DD693D"/>
     <w:rsid w:val="00EC21D5"/>
   </w:rsids>

</xml_diff>